<commit_message>
Tambah paket naskah perundungan yang sudah selesai dan perbarui riwayat fitur
Co-Authored-By: Claude Sonnet 5.5 <noreply@anthropic.com>
Claude-Session: https://claude.ai/code/session_01VXziMfmrv7azvn2pJgs4Ud
</commit_message>
<xml_diff>
--- a/docs/bullying-sdit/D07_AdministrasiKasus_Ninik_v01.docx
+++ b/docs/bullying-sdit/D07_AdministrasiKasus_Ninik_v01.docx
@@ -365,6 +365,7 @@
       <w:tblPr>
         <w:tblW w:type="auto" w:w="0"/>
         <w:jc w:val="center"/>
+        <w:tblLayout w:type="fixed"/>
         <w:tblLook w:firstColumn="1" w:firstRow="1" w:lastColumn="0" w:lastRow="0" w:noHBand="0" w:noVBand="1" w:val="04A0"/>
         <w:tblBorders>
           <w:top w:val="single" w:sz="4" w:color="BFC9C2"/>
@@ -376,12 +377,12 @@
         </w:tblBorders>
       </w:tblPr>
       <w:tblGrid>
-        <w:gridCol w:w="1606"/>
-        <w:gridCol w:w="1606"/>
-        <w:gridCol w:w="1606"/>
-        <w:gridCol w:w="1606"/>
-        <w:gridCol w:w="1606"/>
-        <w:gridCol w:w="1606"/>
+        <w:gridCol w:w="794"/>
+        <w:gridCol w:w="1361"/>
+        <w:gridCol w:w="2948"/>
+        <w:gridCol w:w="1077"/>
+        <w:gridCol w:w="1701"/>
+        <w:gridCol w:w="1757"/>
       </w:tblGrid>
       <w:tr>
         <w:tc>
@@ -1239,6 +1240,7 @@
       <w:tblPr>
         <w:tblW w:type="auto" w:w="0"/>
         <w:jc w:val="center"/>
+        <w:tblLayout w:type="fixed"/>
         <w:tblLook w:firstColumn="1" w:firstRow="1" w:lastColumn="0" w:lastRow="0" w:noHBand="0" w:noVBand="1" w:val="04A0"/>
         <w:tblBorders>
           <w:top w:val="single" w:sz="4" w:color="BFC9C2"/>
@@ -1250,10 +1252,10 @@
         </w:tblBorders>
       </w:tblPr>
       <w:tblGrid>
-        <w:gridCol w:w="2409"/>
-        <w:gridCol w:w="2409"/>
-        <w:gridCol w:w="2409"/>
-        <w:gridCol w:w="2409"/>
+        <w:gridCol w:w="1247"/>
+        <w:gridCol w:w="3515"/>
+        <w:gridCol w:w="3005"/>
+        <w:gridCol w:w="1871"/>
       </w:tblGrid>
       <w:tr>
         <w:tc>
@@ -2023,6 +2025,7 @@
       <w:tblPr>
         <w:tblW w:type="auto" w:w="0"/>
         <w:jc w:val="center"/>
+        <w:tblLayout w:type="fixed"/>
         <w:tblLook w:firstColumn="1" w:firstRow="1" w:lastColumn="0" w:lastRow="0" w:noHBand="0" w:noVBand="1" w:val="04A0"/>
         <w:tblBorders>
           <w:top w:val="single" w:sz="4" w:color="BFC9C2"/>
@@ -2034,8 +2037,8 @@
         </w:tblBorders>
       </w:tblPr>
       <w:tblGrid>
-        <w:gridCol w:w="4819"/>
-        <w:gridCol w:w="4819"/>
+        <w:gridCol w:w="3402"/>
+        <w:gridCol w:w="6236"/>
       </w:tblGrid>
       <w:tr>
         <w:tc>
@@ -2390,297 +2393,13 @@
     </w:tbl>
     <w:p/>
     <w:p>
-      <w:pPr>
-        <w:pStyle w:val="Heading3"/>
-      </w:pPr>
       <w:r>
-        <w:t>FRM-04 Catatan Klarifikasi (format penyeragaman identitas; isi mengikuti D08)</w:t>
+        <w:rPr>
+          <w:i/>
+        </w:rPr>
+        <w:t>Format isi FRM-04 (klarifikasi), FRM-06/07 (keselamatan, pemantauan), dan FRM-09 dimiliki D08/D09 dan dilampirkan pada paket masing-masing; D07 hanya memberi kode, bagian identitas, dan indeksnya.</w:t>
       </w:r>
     </w:p>
-    <w:tbl>
-      <w:tblPr>
-        <w:tblW w:type="auto" w:w="0"/>
-        <w:jc w:val="center"/>
-        <w:tblLook w:firstColumn="1" w:firstRow="1" w:lastColumn="0" w:lastRow="0" w:noHBand="0" w:noVBand="1" w:val="04A0"/>
-        <w:tblBorders>
-          <w:top w:val="single" w:sz="4" w:color="BFC9C2"/>
-          <w:left w:val="single" w:sz="4" w:color="BFC9C2"/>
-          <w:bottom w:val="single" w:sz="4" w:color="BFC9C2"/>
-          <w:right w:val="single" w:sz="4" w:color="BFC9C2"/>
-          <w:insideH w:val="single" w:sz="4" w:color="BFC9C2"/>
-          <w:insideV w:val="single" w:sz="4" w:color="BFC9C2"/>
-        </w:tblBorders>
-      </w:tblPr>
-      <w:tblGrid>
-        <w:gridCol w:w="4819"/>
-        <w:gridCol w:w="4819"/>
-      </w:tblGrid>
-      <w:tr>
-        <w:tc>
-          <w:tcPr>
-            <w:tcW w:type="dxa" w:w="3402"/>
-            <w:shd w:val="clear" w:color="auto" w:fill="0F3B22"/>
-          </w:tcPr>
-          <w:p>
-            <w:r>
-              <w:rPr>
-                <w:b/>
-                <w:color w:val="FAF7F0"/>
-                <w:sz w:val="20"/>
-              </w:rPr>
-              <w:t>Isian</w:t>
-            </w:r>
-          </w:p>
-        </w:tc>
-        <w:tc>
-          <w:tcPr>
-            <w:tcW w:type="dxa" w:w="6236"/>
-            <w:shd w:val="clear" w:color="auto" w:fill="0F3B22"/>
-          </w:tcPr>
-          <w:p>
-            <w:r>
-              <w:rPr>
-                <w:b/>
-                <w:color w:val="FAF7F0"/>
-                <w:sz w:val="20"/>
-              </w:rPr>
-              <w:t>Keterangan / diisi oleh</w:t>
-            </w:r>
-          </w:p>
-        </w:tc>
-      </w:tr>
-      <w:tr>
-        <w:tc>
-          <w:tcPr>
-            <w:tcW w:type="dxa" w:w="3402"/>
-          </w:tcPr>
-          <w:p>
-            <w:r>
-              <w:rPr>
-                <w:sz w:val="20"/>
-              </w:rPr>
-              <w:t>Kode kasus / tanggal / jam / tempat</w:t>
-            </w:r>
-          </w:p>
-        </w:tc>
-        <w:tc>
-          <w:tcPr>
-            <w:tcW w:type="dxa" w:w="6236"/>
-          </w:tcPr>
-          <w:p>
-            <w:r>
-              <w:rPr>
-                <w:sz w:val="20"/>
-              </w:rPr>
-            </w:r>
-          </w:p>
-        </w:tc>
-      </w:tr>
-      <w:tr>
-        <w:tc>
-          <w:tcPr>
-            <w:tcW w:type="dxa" w:w="3402"/>
-            <w:shd w:val="clear" w:color="auto" w:fill="F4F7F5"/>
-          </w:tcPr>
-          <w:p>
-            <w:r>
-              <w:rPr>
-                <w:sz w:val="20"/>
-              </w:rPr>
-              <w:t>Pihak yang didengar (inisial dan peran)</w:t>
-            </w:r>
-          </w:p>
-        </w:tc>
-        <w:tc>
-          <w:tcPr>
-            <w:tcW w:type="dxa" w:w="6236"/>
-            <w:shd w:val="clear" w:color="auto" w:fill="F4F7F5"/>
-          </w:tcPr>
-          <w:p>
-            <w:r>
-              <w:rPr>
-                <w:sz w:val="20"/>
-              </w:rPr>
-              <w:t>Didengar secara terpisah</w:t>
-            </w:r>
-          </w:p>
-        </w:tc>
-      </w:tr>
-      <w:tr>
-        <w:tc>
-          <w:tcPr>
-            <w:tcW w:type="dxa" w:w="3402"/>
-          </w:tcPr>
-          <w:p>
-            <w:r>
-              <w:rPr>
-                <w:sz w:val="20"/>
-              </w:rPr>
-              <w:t>Pendamping anak yang hadir</w:t>
-            </w:r>
-          </w:p>
-        </w:tc>
-        <w:tc>
-          <w:tcPr>
-            <w:tcW w:type="dxa" w:w="6236"/>
-          </w:tcPr>
-          <w:p>
-            <w:r>
-              <w:rPr>
-                <w:sz w:val="20"/>
-              </w:rPr>
-              <w:t>Nama dan jabatan [DIISI SEKOLAH]</w:t>
-            </w:r>
-          </w:p>
-        </w:tc>
-      </w:tr>
-      <w:tr>
-        <w:tc>
-          <w:tcPr>
-            <w:tcW w:type="dxa" w:w="3402"/>
-            <w:shd w:val="clear" w:color="auto" w:fill="F4F7F5"/>
-          </w:tcPr>
-          <w:p>
-            <w:r>
-              <w:rPr>
-                <w:sz w:val="20"/>
-              </w:rPr>
-              <w:t>A. Fakta yang teramati petugas</w:t>
-            </w:r>
-          </w:p>
-        </w:tc>
-        <w:tc>
-          <w:tcPr>
-            <w:tcW w:type="dxa" w:w="6236"/>
-            <w:shd w:val="clear" w:color="auto" w:fill="F4F7F5"/>
-          </w:tcPr>
-          <w:p>
-            <w:r>
-              <w:rPr>
-                <w:sz w:val="20"/>
-              </w:rPr>
-              <w:t>Apa yang dilihat/didengar langsung</w:t>
-            </w:r>
-          </w:p>
-        </w:tc>
-      </w:tr>
-      <w:tr>
-        <w:tc>
-          <w:tcPr>
-            <w:tcW w:type="dxa" w:w="3402"/>
-          </w:tcPr>
-          <w:p>
-            <w:r>
-              <w:rPr>
-                <w:sz w:val="20"/>
-              </w:rPr>
-              <w:t>B. Ucapan pihak terkait</w:t>
-            </w:r>
-          </w:p>
-        </w:tc>
-        <w:tc>
-          <w:tcPr>
-            <w:tcW w:type="dxa" w:w="6236"/>
-          </w:tcPr>
-          <w:p>
-            <w:r>
-              <w:rPr>
-                <w:sz w:val="20"/>
-              </w:rPr>
-              <w:t>Kutipan atau parafrase, sebutkan sumbernya</w:t>
-            </w:r>
-          </w:p>
-        </w:tc>
-      </w:tr>
-      <w:tr>
-        <w:tc>
-          <w:tcPr>
-            <w:tcW w:type="dxa" w:w="3402"/>
-            <w:shd w:val="clear" w:color="auto" w:fill="F4F7F5"/>
-          </w:tcPr>
-          <w:p>
-            <w:r>
-              <w:rPr>
-                <w:sz w:val="20"/>
-              </w:rPr>
-              <w:t>C. Informasi belum diperiksa</w:t>
-            </w:r>
-          </w:p>
-        </w:tc>
-        <w:tc>
-          <w:tcPr>
-            <w:tcW w:type="dxa" w:w="6236"/>
-            <w:shd w:val="clear" w:color="auto" w:fill="F4F7F5"/>
-          </w:tcPr>
-          <w:p>
-            <w:r>
-              <w:rPr>
-                <w:sz w:val="20"/>
-              </w:rPr>
-              <w:t>Apa yang masih perlu dipastikan dan siapa yang memeriksa</w:t>
-            </w:r>
-          </w:p>
-        </w:tc>
-      </w:tr>
-      <w:tr>
-        <w:tc>
-          <w:tcPr>
-            <w:tcW w:type="dxa" w:w="3402"/>
-          </w:tcPr>
-          <w:p>
-            <w:r>
-              <w:rPr>
-                <w:sz w:val="20"/>
-              </w:rPr>
-              <w:t>D. Kesimpulan sementara petugas</w:t>
-            </w:r>
-          </w:p>
-        </w:tc>
-        <w:tc>
-          <w:tcPr>
-            <w:tcW w:type="dxa" w:w="6236"/>
-          </w:tcPr>
-          <w:p>
-            <w:r>
-              <w:rPr>
-                <w:sz w:val="20"/>
-              </w:rPr>
-              <w:t>Terpisah dari A-C; tulis dasar pertimbangan</w:t>
-            </w:r>
-          </w:p>
-        </w:tc>
-      </w:tr>
-      <w:tr>
-        <w:tc>
-          <w:tcPr>
-            <w:tcW w:type="dxa" w:w="3402"/>
-            <w:shd w:val="clear" w:color="auto" w:fill="F4F7F5"/>
-          </w:tcPr>
-          <w:p>
-            <w:r>
-              <w:rPr>
-                <w:sz w:val="20"/>
-              </w:rPr>
-              <w:t>Nama dan paraf petugas</w:t>
-            </w:r>
-          </w:p>
-        </w:tc>
-        <w:tc>
-          <w:tcPr>
-            <w:tcW w:type="dxa" w:w="6236"/>
-            <w:shd w:val="clear" w:color="auto" w:fill="F4F7F5"/>
-          </w:tcPr>
-          <w:p>
-            <w:r>
-              <w:rPr>
-                <w:sz w:val="20"/>
-              </w:rPr>
-            </w:r>
-          </w:p>
-        </w:tc>
-      </w:tr>
-    </w:tbl>
-    <w:p/>
     <w:p>
       <w:pPr>
         <w:pStyle w:val="Heading3"/>
@@ -2693,6 +2412,7 @@
       <w:tblPr>
         <w:tblW w:type="auto" w:w="0"/>
         <w:jc w:val="center"/>
+        <w:tblLayout w:type="fixed"/>
         <w:tblLook w:firstColumn="1" w:firstRow="1" w:lastColumn="0" w:lastRow="0" w:noHBand="0" w:noVBand="1" w:val="04A0"/>
         <w:tblBorders>
           <w:top w:val="single" w:sz="4" w:color="BFC9C2"/>
@@ -2704,8 +2424,8 @@
         </w:tblBorders>
       </w:tblPr>
       <w:tblGrid>
-        <w:gridCol w:w="4819"/>
-        <w:gridCol w:w="4819"/>
+        <w:gridCol w:w="3402"/>
+        <w:gridCol w:w="6236"/>
       </w:tblGrid>
       <w:tr>
         <w:tc>
@@ -2925,6 +2645,7 @@
       <w:tblPr>
         <w:tblW w:type="auto" w:w="0"/>
         <w:jc w:val="center"/>
+        <w:tblLayout w:type="fixed"/>
         <w:tblLook w:firstColumn="1" w:firstRow="1" w:lastColumn="0" w:lastRow="0" w:noHBand="0" w:noVBand="1" w:val="04A0"/>
         <w:tblBorders>
           <w:top w:val="single" w:sz="4" w:color="BFC9C2"/>
@@ -2936,8 +2657,8 @@
         </w:tblBorders>
       </w:tblPr>
       <w:tblGrid>
-        <w:gridCol w:w="4819"/>
-        <w:gridCol w:w="4819"/>
+        <w:gridCol w:w="3402"/>
+        <w:gridCol w:w="6236"/>
       </w:tblGrid>
       <w:tr>
         <w:tc>
@@ -3193,6 +2914,7 @@
       <w:tblPr>
         <w:tblW w:type="auto" w:w="0"/>
         <w:jc w:val="center"/>
+        <w:tblLayout w:type="fixed"/>
         <w:tblLook w:firstColumn="1" w:firstRow="1" w:lastColumn="0" w:lastRow="0" w:noHBand="0" w:noVBand="1" w:val="04A0"/>
         <w:tblBorders>
           <w:top w:val="single" w:sz="4" w:color="BFC9C2"/>
@@ -3204,10 +2926,10 @@
         </w:tblBorders>
       </w:tblPr>
       <w:tblGrid>
-        <w:gridCol w:w="2409"/>
-        <w:gridCol w:w="2409"/>
-        <w:gridCol w:w="2409"/>
-        <w:gridCol w:w="2409"/>
+        <w:gridCol w:w="1020"/>
+        <w:gridCol w:w="1474"/>
+        <w:gridCol w:w="5443"/>
+        <w:gridCol w:w="1701"/>
       </w:tblGrid>
       <w:tr>
         <w:tc>
@@ -3727,6 +3449,7 @@
       <w:tblPr>
         <w:tblW w:type="auto" w:w="0"/>
         <w:jc w:val="center"/>
+        <w:tblLayout w:type="fixed"/>
         <w:tblLook w:firstColumn="1" w:firstRow="1" w:lastColumn="0" w:lastRow="0" w:noHBand="0" w:noVBand="1" w:val="04A0"/>
         <w:tblBorders>
           <w:top w:val="single" w:sz="4" w:color="BFC9C2"/>
@@ -3738,13 +3461,13 @@
         </w:tblBorders>
       </w:tblPr>
       <w:tblGrid>
-        <w:gridCol w:w="1377"/>
-        <w:gridCol w:w="1377"/>
-        <w:gridCol w:w="1377"/>
-        <w:gridCol w:w="1377"/>
-        <w:gridCol w:w="1377"/>
-        <w:gridCol w:w="1377"/>
-        <w:gridCol w:w="1377"/>
+        <w:gridCol w:w="1474"/>
+        <w:gridCol w:w="1134"/>
+        <w:gridCol w:w="1020"/>
+        <w:gridCol w:w="1361"/>
+        <w:gridCol w:w="1701"/>
+        <w:gridCol w:w="1077"/>
+        <w:gridCol w:w="1871"/>
       </w:tblGrid>
       <w:tr>
         <w:tc>
@@ -4426,6 +4149,7 @@
       <w:tblPr>
         <w:tblW w:type="auto" w:w="0"/>
         <w:jc w:val="center"/>
+        <w:tblLayout w:type="fixed"/>
         <w:tblLook w:firstColumn="1" w:firstRow="1" w:lastColumn="0" w:lastRow="0" w:noHBand="0" w:noVBand="1" w:val="04A0"/>
         <w:tblBorders>
           <w:top w:val="single" w:sz="4" w:color="BFC9C2"/>
@@ -4437,13 +4161,13 @@
         </w:tblBorders>
       </w:tblPr>
       <w:tblGrid>
-        <w:gridCol w:w="1377"/>
-        <w:gridCol w:w="1377"/>
-        <w:gridCol w:w="1377"/>
-        <w:gridCol w:w="1377"/>
-        <w:gridCol w:w="1377"/>
-        <w:gridCol w:w="1377"/>
-        <w:gridCol w:w="1377"/>
+        <w:gridCol w:w="567"/>
+        <w:gridCol w:w="2948"/>
+        <w:gridCol w:w="1247"/>
+        <w:gridCol w:w="794"/>
+        <w:gridCol w:w="1247"/>
+        <w:gridCol w:w="1020"/>
+        <w:gridCol w:w="1814"/>
       </w:tblGrid>
       <w:tr>
         <w:tc>
@@ -5402,6 +5126,7 @@
       <w:tblPr>
         <w:tblW w:type="auto" w:w="0"/>
         <w:jc w:val="center"/>
+        <w:tblLayout w:type="fixed"/>
         <w:tblLook w:firstColumn="1" w:firstRow="1" w:lastColumn="0" w:lastRow="0" w:noHBand="0" w:noVBand="1" w:val="04A0"/>
         <w:tblBorders>
           <w:top w:val="single" w:sz="4" w:color="BFC9C2"/>
@@ -5413,13 +5138,13 @@
         </w:tblBorders>
       </w:tblPr>
       <w:tblGrid>
-        <w:gridCol w:w="1377"/>
-        <w:gridCol w:w="1377"/>
-        <w:gridCol w:w="1377"/>
-        <w:gridCol w:w="1377"/>
-        <w:gridCol w:w="1377"/>
-        <w:gridCol w:w="1377"/>
-        <w:gridCol w:w="1377"/>
+        <w:gridCol w:w="1134"/>
+        <w:gridCol w:w="1134"/>
+        <w:gridCol w:w="1701"/>
+        <w:gridCol w:w="1587"/>
+        <w:gridCol w:w="1020"/>
+        <w:gridCol w:w="1587"/>
+        <w:gridCol w:w="1474"/>
       </w:tblGrid>
       <w:tr>
         <w:tc>
@@ -5911,6 +5636,7 @@
       <w:tblPr>
         <w:tblW w:type="auto" w:w="0"/>
         <w:jc w:val="center"/>
+        <w:tblLayout w:type="fixed"/>
         <w:tblLook w:firstColumn="1" w:firstRow="1" w:lastColumn="0" w:lastRow="0" w:noHBand="0" w:noVBand="1" w:val="04A0"/>
         <w:tblBorders>
           <w:top w:val="single" w:sz="4" w:color="BFC9C2"/>
@@ -5922,10 +5648,10 @@
         </w:tblBorders>
       </w:tblPr>
       <w:tblGrid>
-        <w:gridCol w:w="2409"/>
-        <w:gridCol w:w="2409"/>
-        <w:gridCol w:w="2409"/>
-        <w:gridCol w:w="2409"/>
+        <w:gridCol w:w="1984"/>
+        <w:gridCol w:w="2551"/>
+        <w:gridCol w:w="2835"/>
+        <w:gridCol w:w="2268"/>
       </w:tblGrid>
       <w:tr>
         <w:tc>
@@ -6167,6 +5893,7 @@
       <w:tblPr>
         <w:tblW w:type="auto" w:w="0"/>
         <w:jc w:val="center"/>
+        <w:tblLayout w:type="fixed"/>
         <w:tblLook w:firstColumn="1" w:firstRow="1" w:lastColumn="0" w:lastRow="0" w:noHBand="0" w:noVBand="1" w:val="04A0"/>
         <w:tblBorders>
           <w:top w:val="single" w:sz="4" w:color="BFC9C2"/>
@@ -6178,14 +5905,14 @@
         </w:tblBorders>
       </w:tblPr>
       <w:tblGrid>
-        <w:gridCol w:w="1205"/>
-        <w:gridCol w:w="1205"/>
-        <w:gridCol w:w="1205"/>
-        <w:gridCol w:w="1205"/>
-        <w:gridCol w:w="1205"/>
-        <w:gridCol w:w="1205"/>
-        <w:gridCol w:w="1205"/>
-        <w:gridCol w:w="1205"/>
+        <w:gridCol w:w="624"/>
+        <w:gridCol w:w="2721"/>
+        <w:gridCol w:w="1531"/>
+        <w:gridCol w:w="1474"/>
+        <w:gridCol w:w="567"/>
+        <w:gridCol w:w="907"/>
+        <w:gridCol w:w="1020"/>
+        <w:gridCol w:w="794"/>
       </w:tblGrid>
       <w:tr>
         <w:tc>
@@ -8323,6 +8050,7 @@
       <w:tblPr>
         <w:tblW w:type="auto" w:w="0"/>
         <w:jc w:val="center"/>
+        <w:tblLayout w:type="fixed"/>
         <w:tblLook w:firstColumn="1" w:firstRow="1" w:lastColumn="0" w:lastRow="0" w:noHBand="0" w:noVBand="1" w:val="04A0"/>
         <w:tblBorders>
           <w:top w:val="single" w:sz="4" w:color="BFC9C2"/>
@@ -8334,12 +8062,12 @@
         </w:tblBorders>
       </w:tblPr>
       <w:tblGrid>
-        <w:gridCol w:w="1606"/>
-        <w:gridCol w:w="1606"/>
-        <w:gridCol w:w="1606"/>
-        <w:gridCol w:w="1606"/>
-        <w:gridCol w:w="1606"/>
-        <w:gridCol w:w="1606"/>
+        <w:gridCol w:w="1077"/>
+        <w:gridCol w:w="680"/>
+        <w:gridCol w:w="1134"/>
+        <w:gridCol w:w="2721"/>
+        <w:gridCol w:w="2721"/>
+        <w:gridCol w:w="1304"/>
       </w:tblGrid>
       <w:tr>
         <w:tc>
@@ -8673,538 +8401,13 @@
     </w:tbl>
     <w:p/>
     <w:p>
-      <w:pPr>
-        <w:pStyle w:val="Heading2"/>
-      </w:pPr>
       <w:r>
-        <w:t>C.3 Indeks lampiran untuk editor akhir</w:t>
+        <w:rPr>
+          <w:i w:val="0"/>
+        </w:rPr>
+        <w:t>Indeks lampiran untuk editor akhir: templat FRM-01 s.d. FRM-12 (D07, lampiran terkendali, akses petugas); lampiran kelas WK-A s.d. WK-F (wali kelas, akses sesuai isi); materi siswa D15/D16 (Bab III, umum); daftar kontak dan rujukan D13 (umum setelah diverifikasi).</w:t>
       </w:r>
     </w:p>
-    <w:tbl>
-      <w:tblPr>
-        <w:tblW w:type="auto" w:w="0"/>
-        <w:jc w:val="center"/>
-        <w:tblLook w:firstColumn="1" w:firstRow="1" w:lastColumn="0" w:lastRow="0" w:noHBand="0" w:noVBand="1" w:val="04A0"/>
-        <w:tblBorders>
-          <w:top w:val="single" w:sz="4" w:color="BFC9C2"/>
-          <w:left w:val="single" w:sz="4" w:color="BFC9C2"/>
-          <w:bottom w:val="single" w:sz="4" w:color="BFC9C2"/>
-          <w:right w:val="single" w:sz="4" w:color="BFC9C2"/>
-          <w:insideH w:val="single" w:sz="4" w:color="BFC9C2"/>
-          <w:insideV w:val="single" w:sz="4" w:color="BFC9C2"/>
-        </w:tblBorders>
-      </w:tblPr>
-      <w:tblGrid>
-        <w:gridCol w:w="1606"/>
-        <w:gridCol w:w="1606"/>
-        <w:gridCol w:w="1606"/>
-        <w:gridCol w:w="1606"/>
-        <w:gridCol w:w="1606"/>
-        <w:gridCol w:w="1606"/>
-      </w:tblGrid>
-      <w:tr>
-        <w:tc>
-          <w:tcPr>
-            <w:tcW w:type="dxa" w:w="567"/>
-            <w:shd w:val="clear" w:color="auto" w:fill="0F3B22"/>
-          </w:tcPr>
-          <w:p>
-            <w:r>
-              <w:rPr>
-                <w:b/>
-                <w:color w:val="FAF7F0"/>
-                <w:sz w:val="18"/>
-              </w:rPr>
-              <w:t>No.</w:t>
-            </w:r>
-          </w:p>
-        </w:tc>
-        <w:tc>
-          <w:tcPr>
-            <w:tcW w:type="dxa" w:w="3061"/>
-            <w:shd w:val="clear" w:color="auto" w:fill="0F3B22"/>
-          </w:tcPr>
-          <w:p>
-            <w:r>
-              <w:rPr>
-                <w:b/>
-                <w:color w:val="FAF7F0"/>
-                <w:sz w:val="18"/>
-              </w:rPr>
-              <w:t>Lampiran</w:t>
-            </w:r>
-          </w:p>
-        </w:tc>
-        <w:tc>
-          <w:tcPr>
-            <w:tcW w:type="dxa" w:w="1077"/>
-            <w:shd w:val="clear" w:color="auto" w:fill="0F3B22"/>
-          </w:tcPr>
-          <w:p>
-            <w:r>
-              <w:rPr>
-                <w:b/>
-                <w:color w:val="FAF7F0"/>
-                <w:sz w:val="18"/>
-              </w:rPr>
-              <w:t>Kode asal</w:t>
-            </w:r>
-          </w:p>
-        </w:tc>
-        <w:tc>
-          <w:tcPr>
-            <w:tcW w:type="dxa" w:w="2041"/>
-            <w:shd w:val="clear" w:color="auto" w:fill="0F3B22"/>
-          </w:tcPr>
-          <w:p>
-            <w:r>
-              <w:rPr>
-                <w:b/>
-                <w:color w:val="FAF7F0"/>
-                <w:sz w:val="18"/>
-              </w:rPr>
-              <w:t>Letak di dokumen gabungan</w:t>
-            </w:r>
-          </w:p>
-        </w:tc>
-        <w:tc>
-          <w:tcPr>
-            <w:tcW w:type="dxa" w:w="1984"/>
-            <w:shd w:val="clear" w:color="auto" w:fill="0F3B22"/>
-          </w:tcPr>
-          <w:p>
-            <w:r>
-              <w:rPr>
-                <w:b/>
-                <w:color w:val="FAF7F0"/>
-                <w:sz w:val="18"/>
-              </w:rPr>
-              <w:t>Akses (umum / petugas / terbatas)</w:t>
-            </w:r>
-          </w:p>
-        </w:tc>
-        <w:tc>
-          <w:tcPr>
-            <w:tcW w:type="dxa" w:w="907"/>
-            <w:shd w:val="clear" w:color="auto" w:fill="0F3B22"/>
-          </w:tcPr>
-          <w:p>
-            <w:r>
-              <w:rPr>
-                <w:b/>
-                <w:color w:val="FAF7F0"/>
-                <w:sz w:val="18"/>
-              </w:rPr>
-              <w:t>Status</w:t>
-            </w:r>
-          </w:p>
-        </w:tc>
-      </w:tr>
-      <w:tr>
-        <w:tc>
-          <w:tcPr>
-            <w:tcW w:type="dxa" w:w="567"/>
-          </w:tcPr>
-          <w:p>
-            <w:r>
-              <w:rPr>
-                <w:sz w:val="18"/>
-              </w:rPr>
-              <w:t>1</w:t>
-            </w:r>
-          </w:p>
-        </w:tc>
-        <w:tc>
-          <w:tcPr>
-            <w:tcW w:type="dxa" w:w="3061"/>
-          </w:tcPr>
-          <w:p>
-            <w:r>
-              <w:rPr>
-                <w:sz w:val="18"/>
-              </w:rPr>
-              <w:t>Templat kosong formulir FRM-01 s.d. FRM-12</w:t>
-            </w:r>
-          </w:p>
-        </w:tc>
-        <w:tc>
-          <w:tcPr>
-            <w:tcW w:type="dxa" w:w="1077"/>
-          </w:tcPr>
-          <w:p>
-            <w:r>
-              <w:rPr>
-                <w:sz w:val="18"/>
-              </w:rPr>
-              <w:t>D07</w:t>
-            </w:r>
-          </w:p>
-        </w:tc>
-        <w:tc>
-          <w:tcPr>
-            <w:tcW w:type="dxa" w:w="2041"/>
-          </w:tcPr>
-          <w:p>
-            <w:r>
-              <w:rPr>
-                <w:sz w:val="18"/>
-              </w:rPr>
-              <w:t>Lampiran terkendali</w:t>
-            </w:r>
-          </w:p>
-        </w:tc>
-        <w:tc>
-          <w:tcPr>
-            <w:tcW w:type="dxa" w:w="1984"/>
-          </w:tcPr>
-          <w:p>
-            <w:r>
-              <w:rPr>
-                <w:sz w:val="18"/>
-              </w:rPr>
-              <w:t>Petugas</w:t>
-            </w:r>
-          </w:p>
-        </w:tc>
-        <w:tc>
-          <w:tcPr>
-            <w:tcW w:type="dxa" w:w="907"/>
-          </w:tcPr>
-          <w:p>
-            <w:r>
-              <w:rPr>
-                <w:sz w:val="18"/>
-              </w:rPr>
-            </w:r>
-          </w:p>
-        </w:tc>
-      </w:tr>
-      <w:tr>
-        <w:tc>
-          <w:tcPr>
-            <w:tcW w:type="dxa" w:w="567"/>
-            <w:shd w:val="clear" w:color="auto" w:fill="F4F7F5"/>
-          </w:tcPr>
-          <w:p>
-            <w:r>
-              <w:rPr>
-                <w:sz w:val="18"/>
-              </w:rPr>
-              <w:t>2</w:t>
-            </w:r>
-          </w:p>
-        </w:tc>
-        <w:tc>
-          <w:tcPr>
-            <w:tcW w:type="dxa" w:w="3061"/>
-            <w:shd w:val="clear" w:color="auto" w:fill="F4F7F5"/>
-          </w:tcPr>
-          <w:p>
-            <w:r>
-              <w:rPr>
-                <w:sz w:val="18"/>
-              </w:rPr>
-              <w:t>Lampiran kelas WK-A s.d. WK-F (11 kelas)</w:t>
-            </w:r>
-          </w:p>
-        </w:tc>
-        <w:tc>
-          <w:tcPr>
-            <w:tcW w:type="dxa" w:w="1077"/>
-            <w:shd w:val="clear" w:color="auto" w:fill="F4F7F5"/>
-          </w:tcPr>
-          <w:p>
-            <w:r>
-              <w:rPr>
-                <w:sz w:val="18"/>
-              </w:rPr>
-              <w:t>Wali kelas</w:t>
-            </w:r>
-          </w:p>
-        </w:tc>
-        <w:tc>
-          <w:tcPr>
-            <w:tcW w:type="dxa" w:w="2041"/>
-            <w:shd w:val="clear" w:color="auto" w:fill="F4F7F5"/>
-          </w:tcPr>
-          <w:p>
-            <w:r>
-              <w:rPr>
-                <w:sz w:val="18"/>
-              </w:rPr>
-              <w:t>Lampiran terkendali</w:t>
-            </w:r>
-          </w:p>
-        </w:tc>
-        <w:tc>
-          <w:tcPr>
-            <w:tcW w:type="dxa" w:w="1984"/>
-            <w:shd w:val="clear" w:color="auto" w:fill="F4F7F5"/>
-          </w:tcPr>
-          <w:p>
-            <w:r>
-              <w:rPr>
-                <w:sz w:val="18"/>
-              </w:rPr>
-              <w:t>Terbatas / sesuai isi</w:t>
-            </w:r>
-          </w:p>
-        </w:tc>
-        <w:tc>
-          <w:tcPr>
-            <w:tcW w:type="dxa" w:w="907"/>
-            <w:shd w:val="clear" w:color="auto" w:fill="F4F7F5"/>
-          </w:tcPr>
-          <w:p>
-            <w:r>
-              <w:rPr>
-                <w:sz w:val="18"/>
-              </w:rPr>
-            </w:r>
-          </w:p>
-        </w:tc>
-      </w:tr>
-      <w:tr>
-        <w:tc>
-          <w:tcPr>
-            <w:tcW w:type="dxa" w:w="567"/>
-          </w:tcPr>
-          <w:p>
-            <w:r>
-              <w:rPr>
-                <w:sz w:val="18"/>
-              </w:rPr>
-              <w:t>3</w:t>
-            </w:r>
-          </w:p>
-        </w:tc>
-        <w:tc>
-          <w:tcPr>
-            <w:tcW w:type="dxa" w:w="3061"/>
-          </w:tcPr>
-          <w:p>
-            <w:r>
-              <w:rPr>
-                <w:sz w:val="18"/>
-              </w:rPr>
-              <w:t>Materi siswa</w:t>
-            </w:r>
-          </w:p>
-        </w:tc>
-        <w:tc>
-          <w:tcPr>
-            <w:tcW w:type="dxa" w:w="1077"/>
-          </w:tcPr>
-          <w:p>
-            <w:r>
-              <w:rPr>
-                <w:sz w:val="18"/>
-              </w:rPr>
-              <w:t>D15 / D16</w:t>
-            </w:r>
-          </w:p>
-        </w:tc>
-        <w:tc>
-          <w:tcPr>
-            <w:tcW w:type="dxa" w:w="2041"/>
-          </w:tcPr>
-          <w:p>
-            <w:r>
-              <w:rPr>
-                <w:sz w:val="18"/>
-              </w:rPr>
-              <w:t>Bab III</w:t>
-            </w:r>
-          </w:p>
-        </w:tc>
-        <w:tc>
-          <w:tcPr>
-            <w:tcW w:type="dxa" w:w="1984"/>
-          </w:tcPr>
-          <w:p>
-            <w:r>
-              <w:rPr>
-                <w:sz w:val="18"/>
-              </w:rPr>
-              <w:t>Umum</w:t>
-            </w:r>
-          </w:p>
-        </w:tc>
-        <w:tc>
-          <w:tcPr>
-            <w:tcW w:type="dxa" w:w="907"/>
-          </w:tcPr>
-          <w:p>
-            <w:r>
-              <w:rPr>
-                <w:sz w:val="18"/>
-              </w:rPr>
-            </w:r>
-          </w:p>
-        </w:tc>
-      </w:tr>
-      <w:tr>
-        <w:tc>
-          <w:tcPr>
-            <w:tcW w:type="dxa" w:w="567"/>
-            <w:shd w:val="clear" w:color="auto" w:fill="F4F7F5"/>
-          </w:tcPr>
-          <w:p>
-            <w:r>
-              <w:rPr>
-                <w:sz w:val="18"/>
-              </w:rPr>
-              <w:t>4</w:t>
-            </w:r>
-          </w:p>
-        </w:tc>
-        <w:tc>
-          <w:tcPr>
-            <w:tcW w:type="dxa" w:w="3061"/>
-            <w:shd w:val="clear" w:color="auto" w:fill="F4F7F5"/>
-          </w:tcPr>
-          <w:p>
-            <w:r>
-              <w:rPr>
-                <w:sz w:val="18"/>
-              </w:rPr>
-              <w:t>Daftar kontak dan rujukan</w:t>
-            </w:r>
-          </w:p>
-        </w:tc>
-        <w:tc>
-          <w:tcPr>
-            <w:tcW w:type="dxa" w:w="1077"/>
-            <w:shd w:val="clear" w:color="auto" w:fill="F4F7F5"/>
-          </w:tcPr>
-          <w:p>
-            <w:r>
-              <w:rPr>
-                <w:sz w:val="18"/>
-              </w:rPr>
-              <w:t>D13</w:t>
-            </w:r>
-          </w:p>
-        </w:tc>
-        <w:tc>
-          <w:tcPr>
-            <w:tcW w:type="dxa" w:w="2041"/>
-            <w:shd w:val="clear" w:color="auto" w:fill="F4F7F5"/>
-          </w:tcPr>
-          <w:p>
-            <w:r>
-              <w:rPr>
-                <w:sz w:val="18"/>
-              </w:rPr>
-              <w:t>Lampiran terkendali</w:t>
-            </w:r>
-          </w:p>
-        </w:tc>
-        <w:tc>
-          <w:tcPr>
-            <w:tcW w:type="dxa" w:w="1984"/>
-            <w:shd w:val="clear" w:color="auto" w:fill="F4F7F5"/>
-          </w:tcPr>
-          <w:p>
-            <w:r>
-              <w:rPr>
-                <w:sz w:val="18"/>
-              </w:rPr>
-              <w:t>Umum (setelah diverifikasi)</w:t>
-            </w:r>
-          </w:p>
-        </w:tc>
-        <w:tc>
-          <w:tcPr>
-            <w:tcW w:type="dxa" w:w="907"/>
-            <w:shd w:val="clear" w:color="auto" w:fill="F4F7F5"/>
-          </w:tcPr>
-          <w:p>
-            <w:r>
-              <w:rPr>
-                <w:sz w:val="18"/>
-              </w:rPr>
-            </w:r>
-          </w:p>
-        </w:tc>
-      </w:tr>
-      <w:tr>
-        <w:tc>
-          <w:tcPr>
-            <w:tcW w:type="dxa" w:w="567"/>
-          </w:tcPr>
-          <w:p>
-            <w:r>
-              <w:rPr>
-                <w:sz w:val="18"/>
-              </w:rPr>
-              <w:t>5</w:t>
-            </w:r>
-          </w:p>
-        </w:tc>
-        <w:tc>
-          <w:tcPr>
-            <w:tcW w:type="dxa" w:w="3061"/>
-          </w:tcPr>
-          <w:p>
-            <w:r>
-              <w:rPr>
-                <w:sz w:val="18"/>
-              </w:rPr>
-            </w:r>
-          </w:p>
-        </w:tc>
-        <w:tc>
-          <w:tcPr>
-            <w:tcW w:type="dxa" w:w="1077"/>
-          </w:tcPr>
-          <w:p>
-            <w:r>
-              <w:rPr>
-                <w:sz w:val="18"/>
-              </w:rPr>
-            </w:r>
-          </w:p>
-        </w:tc>
-        <w:tc>
-          <w:tcPr>
-            <w:tcW w:type="dxa" w:w="2041"/>
-          </w:tcPr>
-          <w:p>
-            <w:r>
-              <w:rPr>
-                <w:sz w:val="18"/>
-              </w:rPr>
-            </w:r>
-          </w:p>
-        </w:tc>
-        <w:tc>
-          <w:tcPr>
-            <w:tcW w:type="dxa" w:w="1984"/>
-          </w:tcPr>
-          <w:p>
-            <w:r>
-              <w:rPr>
-                <w:sz w:val="18"/>
-              </w:rPr>
-            </w:r>
-          </w:p>
-        </w:tc>
-        <w:tc>
-          <w:tcPr>
-            <w:tcW w:type="dxa" w:w="907"/>
-          </w:tcPr>
-          <w:p>
-            <w:r>
-              <w:rPr>
-                <w:sz w:val="18"/>
-              </w:rPr>
-            </w:r>
-          </w:p>
-        </w:tc>
-      </w:tr>
-    </w:tbl>
-    <w:p/>
     <w:p>
       <w:pPr>
         <w:pStyle w:val="Heading1"/>
@@ -9217,6 +8420,7 @@
       <w:tblPr>
         <w:tblW w:type="auto" w:w="0"/>
         <w:jc w:val="center"/>
+        <w:tblLayout w:type="fixed"/>
         <w:tblLook w:firstColumn="1" w:firstRow="1" w:lastColumn="0" w:lastRow="0" w:noHBand="0" w:noVBand="1" w:val="04A0"/>
         <w:tblBorders>
           <w:top w:val="single" w:sz="4" w:color="BFC9C2"/>
@@ -9228,11 +8432,11 @@
         </w:tblBorders>
       </w:tblPr>
       <w:tblGrid>
-        <w:gridCol w:w="1928"/>
-        <w:gridCol w:w="1928"/>
-        <w:gridCol w:w="1928"/>
-        <w:gridCol w:w="1928"/>
-        <w:gridCol w:w="1928"/>
+        <w:gridCol w:w="567"/>
+        <w:gridCol w:w="5443"/>
+        <w:gridCol w:w="680"/>
+        <w:gridCol w:w="794"/>
+        <w:gridCol w:w="2154"/>
       </w:tblGrid>
       <w:tr>
         <w:tc>
@@ -9922,6 +9126,7 @@
       <w:tblPr>
         <w:tblW w:type="auto" w:w="0"/>
         <w:jc w:val="center"/>
+        <w:tblLayout w:type="fixed"/>
         <w:tblLook w:firstColumn="1" w:firstRow="1" w:lastColumn="0" w:lastRow="0" w:noHBand="0" w:noVBand="1" w:val="04A0"/>
         <w:tblBorders>
           <w:top w:val="single" w:sz="4" w:color="BFC9C2"/>
@@ -9933,8 +9138,8 @@
         </w:tblBorders>
       </w:tblPr>
       <w:tblGrid>
-        <w:gridCol w:w="4819"/>
-        <w:gridCol w:w="4819"/>
+        <w:gridCol w:w="2835"/>
+        <w:gridCol w:w="6803"/>
       </w:tblGrid>
       <w:tr>
         <w:tc>

</xml_diff>